<commit_message>
update peer evaluation form
</commit_message>
<xml_diff>
--- a/document/AAI_520_Final_Team_Project_Peer_Evaluation_Form.docx
+++ b/document/AAI_520_Final_Team_Project_Peer_Evaluation_Form.docx
@@ -56,27 +56,13 @@
         <w:rPr>
           <w:rFonts w:ascii="Times New Roman" w:eastAsia="Times New Roman" w:hAnsi="Times New Roman" w:cs="Times New Roman"/>
         </w:rPr>
-        <w:t>Your Name: ____________________________________________________</w:t>
-      </w:r>
-    </w:p>
-    <w:p>
-      <w:pPr>
-        <w:rPr>
-          <w:rFonts w:ascii="Times New Roman" w:eastAsia="Times New Roman" w:hAnsi="Times New Roman" w:cs="Times New Roman"/>
-        </w:rPr>
-      </w:pPr>
-    </w:p>
-    <w:p>
-      <w:pPr>
-        <w:rPr>
-          <w:rFonts w:ascii="Times New Roman" w:eastAsia="Times New Roman" w:hAnsi="Times New Roman" w:cs="Times New Roman"/>
-        </w:rPr>
-      </w:pPr>
-      <w:r>
-        <w:rPr>
-          <w:rFonts w:ascii="Times New Roman" w:eastAsia="Times New Roman" w:hAnsi="Times New Roman" w:cs="Times New Roman"/>
-        </w:rPr>
-        <w:t>Your Team Members’ Name(s): ________________________________________________</w:t>
+        <w:t xml:space="preserve">Your Name: </w:t>
+      </w:r>
+      <w:r>
+        <w:rPr>
+          <w:rFonts w:ascii="Times New Roman" w:eastAsia="Times New Roman" w:hAnsi="Times New Roman" w:cs="Times New Roman"/>
+        </w:rPr>
+        <w:t>Matt Hashemi</w:t>
       </w:r>
     </w:p>
     <w:p>
@@ -224,7 +210,7 @@
     <w:tbl>
       <w:tblPr>
         <w:tblStyle w:val="a"/>
-        <w:tblW w:w="9175" w:type="dxa"/>
+        <w:tblW w:w="9630" w:type="dxa"/>
         <w:jc w:val="center"/>
         <w:tblBorders>
           <w:top w:val="single" w:sz="4" w:space="0" w:color="000000"/>
@@ -238,9 +224,8 @@
         <w:tblLook w:val="0000" w:firstRow="0" w:lastRow="0" w:firstColumn="0" w:lastColumn="0" w:noHBand="0" w:noVBand="0"/>
       </w:tblPr>
       <w:tblGrid>
-        <w:gridCol w:w="4135"/>
-        <w:gridCol w:w="2520"/>
-        <w:gridCol w:w="2520"/>
+        <w:gridCol w:w="7380"/>
+        <w:gridCol w:w="2250"/>
       </w:tblGrid>
       <w:tr>
         <w:trPr>
@@ -249,7 +234,7 @@
         </w:trPr>
         <w:tc>
           <w:tcPr>
-            <w:tcW w:w="4135" w:type="dxa"/>
+            <w:tcW w:w="7380" w:type="dxa"/>
           </w:tcPr>
           <w:p>
             <w:pPr>
@@ -276,7 +261,7 @@
         </w:tc>
         <w:tc>
           <w:tcPr>
-            <w:tcW w:w="2520" w:type="dxa"/>
+            <w:tcW w:w="2250" w:type="dxa"/>
           </w:tcPr>
           <w:p>
             <w:pPr>
@@ -297,17 +282,10 @@
                 <w:sz w:val="22"/>
                 <w:szCs w:val="22"/>
               </w:rPr>
-              <w:t xml:space="preserve">Team member name:______ </w:t>
-            </w:r>
-          </w:p>
-        </w:tc>
-        <w:tc>
-          <w:tcPr>
-            <w:tcW w:w="2520" w:type="dxa"/>
-          </w:tcPr>
-          <w:p>
-            <w:pPr>
-              <w:jc w:val="center"/>
+              <w:t xml:space="preserve">Team member </w:t>
+            </w:r>
+            <w:proofErr w:type="gramStart"/>
+            <w:r>
               <w:rPr>
                 <w:rFonts w:ascii="Times New Roman" w:eastAsia="Times New Roman" w:hAnsi="Times New Roman" w:cs="Times New Roman"/>
                 <w:b/>
@@ -315,7 +293,9 @@
                 <w:sz w:val="22"/>
                 <w:szCs w:val="22"/>
               </w:rPr>
-            </w:pPr>
+              <w:t>name:_</w:t>
+            </w:r>
+            <w:proofErr w:type="gramEnd"/>
             <w:r>
               <w:rPr>
                 <w:rFonts w:ascii="Times New Roman" w:eastAsia="Times New Roman" w:hAnsi="Times New Roman" w:cs="Times New Roman"/>
@@ -324,20 +304,8 @@
                 <w:sz w:val="22"/>
                 <w:szCs w:val="22"/>
               </w:rPr>
-              <w:t xml:space="preserve">Team member name:______ </w:t>
-            </w:r>
-          </w:p>
-          <w:p>
-            <w:pPr>
-              <w:jc w:val="center"/>
-              <w:rPr>
-                <w:rFonts w:ascii="Times New Roman" w:eastAsia="Times New Roman" w:hAnsi="Times New Roman" w:cs="Times New Roman"/>
-                <w:b/>
-                <w:color w:val="1F497D"/>
-                <w:sz w:val="22"/>
-                <w:szCs w:val="22"/>
-              </w:rPr>
-            </w:pPr>
+              <w:t xml:space="preserve">_____ </w:t>
+            </w:r>
           </w:p>
         </w:tc>
       </w:tr>
@@ -348,7 +316,7 @@
         </w:trPr>
         <w:tc>
           <w:tcPr>
-            <w:tcW w:w="4135" w:type="dxa"/>
+            <w:tcW w:w="7380" w:type="dxa"/>
           </w:tcPr>
           <w:p>
             <w:pPr>
@@ -381,7 +349,7 @@
         </w:tc>
         <w:tc>
           <w:tcPr>
-            <w:tcW w:w="2520" w:type="dxa"/>
+            <w:tcW w:w="2250" w:type="dxa"/>
           </w:tcPr>
           <w:p>
             <w:pPr>
@@ -394,26 +362,7 @@
               <w:rPr>
                 <w:rFonts w:ascii="Times New Roman" w:eastAsia="Times New Roman" w:hAnsi="Times New Roman" w:cs="Times New Roman"/>
               </w:rPr>
-              <w:t>___/out of 5</w:t>
-            </w:r>
-          </w:p>
-        </w:tc>
-        <w:tc>
-          <w:tcPr>
-            <w:tcW w:w="2520" w:type="dxa"/>
-          </w:tcPr>
-          <w:p>
-            <w:pPr>
-              <w:jc w:val="center"/>
-              <w:rPr>
-                <w:rFonts w:ascii="Times New Roman" w:eastAsia="Times New Roman" w:hAnsi="Times New Roman" w:cs="Times New Roman"/>
-              </w:rPr>
-            </w:pPr>
-            <w:r>
-              <w:rPr>
-                <w:rFonts w:ascii="Times New Roman" w:eastAsia="Times New Roman" w:hAnsi="Times New Roman" w:cs="Times New Roman"/>
-              </w:rPr>
-              <w:t>___/out of 5</w:t>
+              <w:t>__5_/out of 5</w:t>
             </w:r>
           </w:p>
         </w:tc>
@@ -425,7 +374,7 @@
         </w:trPr>
         <w:tc>
           <w:tcPr>
-            <w:tcW w:w="4135" w:type="dxa"/>
+            <w:tcW w:w="7380" w:type="dxa"/>
           </w:tcPr>
           <w:p>
             <w:pPr>
@@ -458,7 +407,7 @@
         </w:tc>
         <w:tc>
           <w:tcPr>
-            <w:tcW w:w="2520" w:type="dxa"/>
+            <w:tcW w:w="2250" w:type="dxa"/>
           </w:tcPr>
           <w:p>
             <w:pPr>
@@ -471,26 +420,7 @@
               <w:rPr>
                 <w:rFonts w:ascii="Times New Roman" w:eastAsia="Times New Roman" w:hAnsi="Times New Roman" w:cs="Times New Roman"/>
               </w:rPr>
-              <w:t>___/out of 5</w:t>
-            </w:r>
-          </w:p>
-        </w:tc>
-        <w:tc>
-          <w:tcPr>
-            <w:tcW w:w="2520" w:type="dxa"/>
-          </w:tcPr>
-          <w:p>
-            <w:pPr>
-              <w:jc w:val="center"/>
-              <w:rPr>
-                <w:rFonts w:ascii="Times New Roman" w:eastAsia="Times New Roman" w:hAnsi="Times New Roman" w:cs="Times New Roman"/>
-              </w:rPr>
-            </w:pPr>
-            <w:r>
-              <w:rPr>
-                <w:rFonts w:ascii="Times New Roman" w:eastAsia="Times New Roman" w:hAnsi="Times New Roman" w:cs="Times New Roman"/>
-              </w:rPr>
-              <w:t>___/out of 5</w:t>
+              <w:t>__5_/out of 5</w:t>
             </w:r>
           </w:p>
         </w:tc>
@@ -502,7 +432,7 @@
         </w:trPr>
         <w:tc>
           <w:tcPr>
-            <w:tcW w:w="4135" w:type="dxa"/>
+            <w:tcW w:w="7380" w:type="dxa"/>
           </w:tcPr>
           <w:p>
             <w:pPr>
@@ -535,7 +465,7 @@
         </w:tc>
         <w:tc>
           <w:tcPr>
-            <w:tcW w:w="2520" w:type="dxa"/>
+            <w:tcW w:w="2250" w:type="dxa"/>
           </w:tcPr>
           <w:p>
             <w:pPr>
@@ -548,26 +478,7 @@
               <w:rPr>
                 <w:rFonts w:ascii="Times New Roman" w:eastAsia="Times New Roman" w:hAnsi="Times New Roman" w:cs="Times New Roman"/>
               </w:rPr>
-              <w:t>___/out of 5</w:t>
-            </w:r>
-          </w:p>
-        </w:tc>
-        <w:tc>
-          <w:tcPr>
-            <w:tcW w:w="2520" w:type="dxa"/>
-          </w:tcPr>
-          <w:p>
-            <w:pPr>
-              <w:jc w:val="center"/>
-              <w:rPr>
-                <w:rFonts w:ascii="Times New Roman" w:eastAsia="Times New Roman" w:hAnsi="Times New Roman" w:cs="Times New Roman"/>
-              </w:rPr>
-            </w:pPr>
-            <w:r>
-              <w:rPr>
-                <w:rFonts w:ascii="Times New Roman" w:eastAsia="Times New Roman" w:hAnsi="Times New Roman" w:cs="Times New Roman"/>
-              </w:rPr>
-              <w:t>___/out of 5</w:t>
+              <w:t>__5_/out of 5</w:t>
             </w:r>
           </w:p>
         </w:tc>
@@ -579,7 +490,7 @@
         </w:trPr>
         <w:tc>
           <w:tcPr>
-            <w:tcW w:w="4135" w:type="dxa"/>
+            <w:tcW w:w="7380" w:type="dxa"/>
           </w:tcPr>
           <w:p>
             <w:pPr>
@@ -612,7 +523,7 @@
         </w:tc>
         <w:tc>
           <w:tcPr>
-            <w:tcW w:w="2520" w:type="dxa"/>
+            <w:tcW w:w="2250" w:type="dxa"/>
           </w:tcPr>
           <w:p>
             <w:pPr>
@@ -625,26 +536,7 @@
               <w:rPr>
                 <w:rFonts w:ascii="Times New Roman" w:eastAsia="Times New Roman" w:hAnsi="Times New Roman" w:cs="Times New Roman"/>
               </w:rPr>
-              <w:t>___/out of 5</w:t>
-            </w:r>
-          </w:p>
-        </w:tc>
-        <w:tc>
-          <w:tcPr>
-            <w:tcW w:w="2520" w:type="dxa"/>
-          </w:tcPr>
-          <w:p>
-            <w:pPr>
-              <w:jc w:val="center"/>
-              <w:rPr>
-                <w:rFonts w:ascii="Times New Roman" w:eastAsia="Times New Roman" w:hAnsi="Times New Roman" w:cs="Times New Roman"/>
-              </w:rPr>
-            </w:pPr>
-            <w:r>
-              <w:rPr>
-                <w:rFonts w:ascii="Times New Roman" w:eastAsia="Times New Roman" w:hAnsi="Times New Roman" w:cs="Times New Roman"/>
-              </w:rPr>
-              <w:t>___/out of 5</w:t>
+              <w:t>__5_/out of 5</w:t>
             </w:r>
           </w:p>
         </w:tc>
@@ -656,7 +548,7 @@
         </w:trPr>
         <w:tc>
           <w:tcPr>
-            <w:tcW w:w="4135" w:type="dxa"/>
+            <w:tcW w:w="7380" w:type="dxa"/>
           </w:tcPr>
           <w:p>
             <w:pPr>
@@ -683,27 +575,13 @@
                 <w:rFonts w:ascii="Times New Roman" w:eastAsia="Times New Roman" w:hAnsi="Times New Roman" w:cs="Times New Roman"/>
                 <w:color w:val="000000"/>
               </w:rPr>
-              <w:t xml:space="preserve">Contributed meaningfully to developing </w:t>
-            </w:r>
-            <w:r>
-              <w:rPr>
-                <w:rFonts w:ascii="Times New Roman" w:eastAsia="Times New Roman" w:hAnsi="Times New Roman" w:cs="Times New Roman"/>
-                <w:color w:val="000000"/>
-              </w:rPr>
-              <w:t>final deliverables</w:t>
-            </w:r>
-            <w:r>
-              <w:rPr>
-                <w:rFonts w:ascii="Times New Roman" w:eastAsia="Times New Roman" w:hAnsi="Times New Roman" w:cs="Times New Roman"/>
-                <w:color w:val="000000"/>
-              </w:rPr>
-              <w:t>.</w:t>
+              <w:t>Contributed meaningfully to developing final deliverables.</w:t>
             </w:r>
           </w:p>
         </w:tc>
         <w:tc>
           <w:tcPr>
-            <w:tcW w:w="2520" w:type="dxa"/>
+            <w:tcW w:w="2250" w:type="dxa"/>
           </w:tcPr>
           <w:p>
             <w:pPr>
@@ -716,26 +594,7 @@
               <w:rPr>
                 <w:rFonts w:ascii="Times New Roman" w:eastAsia="Times New Roman" w:hAnsi="Times New Roman" w:cs="Times New Roman"/>
               </w:rPr>
-              <w:t>___/out of 5</w:t>
-            </w:r>
-          </w:p>
-        </w:tc>
-        <w:tc>
-          <w:tcPr>
-            <w:tcW w:w="2520" w:type="dxa"/>
-          </w:tcPr>
-          <w:p>
-            <w:pPr>
-              <w:jc w:val="center"/>
-              <w:rPr>
-                <w:rFonts w:ascii="Times New Roman" w:eastAsia="Times New Roman" w:hAnsi="Times New Roman" w:cs="Times New Roman"/>
-              </w:rPr>
-            </w:pPr>
-            <w:r>
-              <w:rPr>
-                <w:rFonts w:ascii="Times New Roman" w:eastAsia="Times New Roman" w:hAnsi="Times New Roman" w:cs="Times New Roman"/>
-              </w:rPr>
-              <w:t>___/out of 5</w:t>
+              <w:t>__5_/out of 5</w:t>
             </w:r>
           </w:p>
         </w:tc>
@@ -747,7 +606,7 @@
         </w:trPr>
         <w:tc>
           <w:tcPr>
-            <w:tcW w:w="4135" w:type="dxa"/>
+            <w:tcW w:w="7380" w:type="dxa"/>
           </w:tcPr>
           <w:p>
             <w:pPr>
@@ -780,7 +639,7 @@
         </w:tc>
         <w:tc>
           <w:tcPr>
-            <w:tcW w:w="2520" w:type="dxa"/>
+            <w:tcW w:w="2250" w:type="dxa"/>
           </w:tcPr>
           <w:p>
             <w:pPr>
@@ -793,26 +652,7 @@
               <w:rPr>
                 <w:rFonts w:ascii="Times New Roman" w:eastAsia="Times New Roman" w:hAnsi="Times New Roman" w:cs="Times New Roman"/>
               </w:rPr>
-              <w:t>___/out of 5</w:t>
-            </w:r>
-          </w:p>
-        </w:tc>
-        <w:tc>
-          <w:tcPr>
-            <w:tcW w:w="2520" w:type="dxa"/>
-          </w:tcPr>
-          <w:p>
-            <w:pPr>
-              <w:jc w:val="center"/>
-              <w:rPr>
-                <w:rFonts w:ascii="Times New Roman" w:eastAsia="Times New Roman" w:hAnsi="Times New Roman" w:cs="Times New Roman"/>
-              </w:rPr>
-            </w:pPr>
-            <w:r>
-              <w:rPr>
-                <w:rFonts w:ascii="Times New Roman" w:eastAsia="Times New Roman" w:hAnsi="Times New Roman" w:cs="Times New Roman"/>
-              </w:rPr>
-              <w:t>___/out of 5</w:t>
+              <w:t>__5_/out of 5</w:t>
             </w:r>
           </w:p>
         </w:tc>
@@ -824,7 +664,7 @@
         </w:trPr>
         <w:tc>
           <w:tcPr>
-            <w:tcW w:w="4135" w:type="dxa"/>
+            <w:tcW w:w="7380" w:type="dxa"/>
           </w:tcPr>
           <w:p>
             <w:pPr>
@@ -857,7 +697,7 @@
         </w:tc>
         <w:tc>
           <w:tcPr>
-            <w:tcW w:w="2520" w:type="dxa"/>
+            <w:tcW w:w="2250" w:type="dxa"/>
           </w:tcPr>
           <w:p>
             <w:pPr>
@@ -870,26 +710,7 @@
               <w:rPr>
                 <w:rFonts w:ascii="Times New Roman" w:eastAsia="Times New Roman" w:hAnsi="Times New Roman" w:cs="Times New Roman"/>
               </w:rPr>
-              <w:t>___/out of 5</w:t>
-            </w:r>
-          </w:p>
-        </w:tc>
-        <w:tc>
-          <w:tcPr>
-            <w:tcW w:w="2520" w:type="dxa"/>
-          </w:tcPr>
-          <w:p>
-            <w:pPr>
-              <w:jc w:val="center"/>
-              <w:rPr>
-                <w:rFonts w:ascii="Times New Roman" w:eastAsia="Times New Roman" w:hAnsi="Times New Roman" w:cs="Times New Roman"/>
-              </w:rPr>
-            </w:pPr>
-            <w:r>
-              <w:rPr>
-                <w:rFonts w:ascii="Times New Roman" w:eastAsia="Times New Roman" w:hAnsi="Times New Roman" w:cs="Times New Roman"/>
-              </w:rPr>
-              <w:t>___/out of 5</w:t>
+              <w:t>__5_/out of 5</w:t>
             </w:r>
           </w:p>
         </w:tc>
@@ -901,7 +722,7 @@
         </w:trPr>
         <w:tc>
           <w:tcPr>
-            <w:tcW w:w="4135" w:type="dxa"/>
+            <w:tcW w:w="7380" w:type="dxa"/>
           </w:tcPr>
           <w:p>
             <w:pPr>
@@ -1104,7 +925,6 @@
                 <w:rFonts w:ascii="Times New Roman" w:eastAsia="Times New Roman" w:hAnsi="Times New Roman" w:cs="Times New Roman"/>
                 <w:color w:val="000000"/>
               </w:rPr>
-              <w:lastRenderedPageBreak/>
               <w:t>C: 4-5 points</w:t>
             </w:r>
           </w:p>
@@ -1167,7 +987,7 @@
         </w:tc>
         <w:tc>
           <w:tcPr>
-            <w:tcW w:w="2520" w:type="dxa"/>
+            <w:tcW w:w="2250" w:type="dxa"/>
           </w:tcPr>
           <w:p>
             <w:pPr>
@@ -1180,27 +1000,7 @@
               <w:rPr>
                 <w:rFonts w:ascii="Times New Roman" w:eastAsia="Times New Roman" w:hAnsi="Times New Roman" w:cs="Times New Roman"/>
               </w:rPr>
-              <w:lastRenderedPageBreak/>
-              <w:t>___/out of 10</w:t>
-            </w:r>
-          </w:p>
-        </w:tc>
-        <w:tc>
-          <w:tcPr>
-            <w:tcW w:w="2520" w:type="dxa"/>
-          </w:tcPr>
-          <w:p>
-            <w:pPr>
-              <w:jc w:val="center"/>
-              <w:rPr>
-                <w:rFonts w:ascii="Times New Roman" w:eastAsia="Times New Roman" w:hAnsi="Times New Roman" w:cs="Times New Roman"/>
-              </w:rPr>
-            </w:pPr>
-            <w:r>
-              <w:rPr>
-                <w:rFonts w:ascii="Times New Roman" w:eastAsia="Times New Roman" w:hAnsi="Times New Roman" w:cs="Times New Roman"/>
-              </w:rPr>
-              <w:t>___/out of 10</w:t>
+              <w:t>__10_/out of 10</w:t>
             </w:r>
           </w:p>
         </w:tc>
@@ -1212,7 +1012,7 @@
         </w:trPr>
         <w:tc>
           <w:tcPr>
-            <w:tcW w:w="4135" w:type="dxa"/>
+            <w:tcW w:w="7380" w:type="dxa"/>
           </w:tcPr>
           <w:p>
             <w:pPr>
@@ -1227,34 +1027,13 @@
                 <w:rFonts w:ascii="Times New Roman" w:eastAsia="Times New Roman" w:hAnsi="Times New Roman" w:cs="Times New Roman"/>
                 <w:b/>
               </w:rPr>
-              <w:t xml:space="preserve">Totals (out of </w:t>
-            </w:r>
-            <w:r>
-              <w:rPr>
-                <w:rFonts w:ascii="Times New Roman" w:eastAsia="Times New Roman" w:hAnsi="Times New Roman" w:cs="Times New Roman"/>
-                <w:b/>
-              </w:rPr>
-              <w:t>4</w:t>
-            </w:r>
-            <w:r>
-              <w:rPr>
-                <w:rFonts w:ascii="Times New Roman" w:eastAsia="Times New Roman" w:hAnsi="Times New Roman" w:cs="Times New Roman"/>
-                <w:b/>
-              </w:rPr>
-              <w:t>5</w:t>
-            </w:r>
-            <w:r>
-              <w:rPr>
-                <w:rFonts w:ascii="Times New Roman" w:eastAsia="Times New Roman" w:hAnsi="Times New Roman" w:cs="Times New Roman"/>
-                <w:b/>
-              </w:rPr>
-              <w:t>)</w:t>
+              <w:t>Totals (out of 45)</w:t>
             </w:r>
           </w:p>
         </w:tc>
         <w:tc>
           <w:tcPr>
-            <w:tcW w:w="2520" w:type="dxa"/>
+            <w:tcW w:w="2250" w:type="dxa"/>
           </w:tcPr>
           <w:p>
             <w:pPr>
@@ -1267,34 +1046,7 @@
               <w:rPr>
                 <w:rFonts w:ascii="Times New Roman" w:eastAsia="Times New Roman" w:hAnsi="Times New Roman" w:cs="Times New Roman"/>
               </w:rPr>
-              <w:t>___/out of 45</w:t>
-            </w:r>
-          </w:p>
-          <w:p>
-            <w:pPr>
-              <w:jc w:val="center"/>
-              <w:rPr>
-                <w:rFonts w:ascii="Times New Roman" w:eastAsia="Times New Roman" w:hAnsi="Times New Roman" w:cs="Times New Roman"/>
-              </w:rPr>
-            </w:pPr>
-          </w:p>
-        </w:tc>
-        <w:tc>
-          <w:tcPr>
-            <w:tcW w:w="2520" w:type="dxa"/>
-          </w:tcPr>
-          <w:p>
-            <w:pPr>
-              <w:jc w:val="center"/>
-              <w:rPr>
-                <w:rFonts w:ascii="Times New Roman" w:eastAsia="Times New Roman" w:hAnsi="Times New Roman" w:cs="Times New Roman"/>
-              </w:rPr>
-            </w:pPr>
-            <w:r>
-              <w:rPr>
-                <w:rFonts w:ascii="Times New Roman" w:eastAsia="Times New Roman" w:hAnsi="Times New Roman" w:cs="Times New Roman"/>
-              </w:rPr>
-              <w:t>___/out of 45</w:t>
+              <w:t>__45_/out of 45</w:t>
             </w:r>
           </w:p>
           <w:p>
@@ -1314,19 +1066,6 @@
           <w:rFonts w:ascii="Times New Roman" w:eastAsia="Times New Roman" w:hAnsi="Times New Roman" w:cs="Times New Roman"/>
         </w:rPr>
       </w:pPr>
-    </w:p>
-    <w:p>
-      <w:pPr>
-        <w:rPr>
-          <w:rFonts w:ascii="Times New Roman" w:eastAsia="Times New Roman" w:hAnsi="Times New Roman" w:cs="Times New Roman"/>
-        </w:rPr>
-      </w:pPr>
-      <w:r>
-        <w:rPr>
-          <w:rFonts w:ascii="Times New Roman" w:eastAsia="Times New Roman" w:hAnsi="Times New Roman" w:cs="Times New Roman"/>
-        </w:rPr>
-        <w:t xml:space="preserve">Comments: </w:t>
-      </w:r>
     </w:p>
     <w:sectPr>
       <w:headerReference w:type="default" r:id="rId8"/>

</xml_diff>